<commit_message>
Add stock REST endpoints,Exception,service,controller,Appconfig
</commit_message>
<xml_diff>
--- a/SambhavSetup.docx
+++ b/SambhavSetup.docx
@@ -9,19 +9,11 @@
     </w:p>
     <w:p>
       <w:r>
-        <w:t xml:space="preserve">Sambhav </w:t>
-      </w:r>
-      <w:proofErr w:type="spellStart"/>
-      <w:r>
-        <w:t>jain</w:t>
-      </w:r>
-      <w:proofErr w:type="spellEnd"/>
-      <w:r>
-        <w:t>:</w:t>
-      </w:r>
-    </w:p>
-    <w:p>
-      <w:hyperlink r:id="rId4" w:history="1">
+        <w:t>Sambhav jain:</w:t>
+      </w:r>
+    </w:p>
+    <w:p>
+      <w:hyperlink r:id="rId5" w:history="1">
         <w:r>
           <w:rPr>
             <w:rStyle w:val="Hyperlink"/>
@@ -37,6 +29,9 @@
     </w:p>
     <w:p>
       <w:r>
+        <w:rPr>
+          <w:noProof/>
+        </w:rPr>
         <w:drawing>
           <wp:inline distT="0" distB="0" distL="0" distR="0" wp14:anchorId="24D9385D" wp14:editId="78E05E0D">
             <wp:extent cx="5731510" cy="2490470"/>
@@ -53,7 +48,7 @@
                     <pic:cNvPicPr/>
                   </pic:nvPicPr>
                   <pic:blipFill>
-                    <a:blip r:embed="rId5"/>
+                    <a:blip r:embed="rId6"/>
                     <a:stretch>
                       <a:fillRect/>
                     </a:stretch>
@@ -81,6 +76,9 @@
     </w:p>
     <w:p>
       <w:r>
+        <w:rPr>
+          <w:noProof/>
+        </w:rPr>
         <w:drawing>
           <wp:inline distT="0" distB="0" distL="0" distR="0" wp14:anchorId="6545F00E" wp14:editId="4A2E6644">
             <wp:extent cx="5731510" cy="2679700"/>
@@ -97,7 +95,7 @@
                     <pic:cNvPicPr/>
                   </pic:nvPicPr>
                   <pic:blipFill>
-                    <a:blip r:embed="rId6"/>
+                    <a:blip r:embed="rId7"/>
                     <a:stretch>
                       <a:fillRect/>
                     </a:stretch>
@@ -118,6 +116,679 @@
         </w:drawing>
       </w:r>
     </w:p>
+    <w:p/>
+    <w:p/>
+    <w:p>
+      <w:r>
+        <w:rPr>
+          <w:noProof/>
+        </w:rPr>
+        <w:lastRenderedPageBreak/>
+        <w:drawing>
+          <wp:inline distT="0" distB="0" distL="0" distR="0" wp14:anchorId="38759BFB" wp14:editId="3C03179E">
+            <wp:extent cx="5712460" cy="3205480"/>
+            <wp:effectExtent l="0" t="0" r="2540" b="0"/>
+            <wp:docPr id="1601634334" name="Picture 2"/>
+            <wp:cNvGraphicFramePr>
+              <a:graphicFrameLocks xmlns:a="http://schemas.openxmlformats.org/drawingml/2006/main" noChangeAspect="1"/>
+            </wp:cNvGraphicFramePr>
+            <a:graphic xmlns:a="http://schemas.openxmlformats.org/drawingml/2006/main">
+              <a:graphicData uri="http://schemas.openxmlformats.org/drawingml/2006/picture">
+                <pic:pic xmlns:pic="http://schemas.openxmlformats.org/drawingml/2006/picture">
+                  <pic:nvPicPr>
+                    <pic:cNvPr id="0" name="Picture 2"/>
+                    <pic:cNvPicPr>
+                      <a:picLocks noChangeAspect="1" noChangeArrowheads="1"/>
+                    </pic:cNvPicPr>
+                  </pic:nvPicPr>
+                  <pic:blipFill>
+                    <a:blip r:embed="rId8" cstate="print">
+                      <a:extLst>
+                        <a:ext uri="{28A0092B-C50C-407E-A947-70E740481C1C}">
+                          <a14:useLocalDpi xmlns:a14="http://schemas.microsoft.com/office/drawing/2010/main" val="0"/>
+                        </a:ext>
+                      </a:extLst>
+                    </a:blip>
+                    <a:srcRect/>
+                    <a:stretch>
+                      <a:fillRect/>
+                    </a:stretch>
+                  </pic:blipFill>
+                  <pic:spPr bwMode="auto">
+                    <a:xfrm>
+                      <a:off x="0" y="0"/>
+                      <a:ext cx="5712460" cy="3205480"/>
+                    </a:xfrm>
+                    <a:prstGeom prst="rect">
+                      <a:avLst/>
+                    </a:prstGeom>
+                    <a:noFill/>
+                    <a:ln>
+                      <a:noFill/>
+                    </a:ln>
+                  </pic:spPr>
+                </pic:pic>
+              </a:graphicData>
+            </a:graphic>
+          </wp:inline>
+        </w:drawing>
+      </w:r>
+    </w:p>
+    <w:p/>
+    <w:p>
+      <w:r>
+        <w:t>Medicine service:</w:t>
+      </w:r>
+    </w:p>
+    <w:p>
+      <w:r>
+        <w:t>Postgresql</w:t>
+      </w:r>
+    </w:p>
+    <w:p>
+      <w:r>
+        <w:drawing>
+          <wp:inline distT="0" distB="0" distL="0" distR="0" wp14:anchorId="42FDC114" wp14:editId="3D4EB947">
+            <wp:extent cx="5731510" cy="3101975"/>
+            <wp:effectExtent l="0" t="0" r="2540" b="3175"/>
+            <wp:docPr id="205598934" name="Picture 1"/>
+            <wp:cNvGraphicFramePr>
+              <a:graphicFrameLocks xmlns:a="http://schemas.openxmlformats.org/drawingml/2006/main" noChangeAspect="1"/>
+            </wp:cNvGraphicFramePr>
+            <a:graphic xmlns:a="http://schemas.openxmlformats.org/drawingml/2006/main">
+              <a:graphicData uri="http://schemas.openxmlformats.org/drawingml/2006/picture">
+                <pic:pic xmlns:pic="http://schemas.openxmlformats.org/drawingml/2006/picture">
+                  <pic:nvPicPr>
+                    <pic:cNvPr id="205598934" name=""/>
+                    <pic:cNvPicPr/>
+                  </pic:nvPicPr>
+                  <pic:blipFill>
+                    <a:blip r:embed="rId9"/>
+                    <a:stretch>
+                      <a:fillRect/>
+                    </a:stretch>
+                  </pic:blipFill>
+                  <pic:spPr>
+                    <a:xfrm>
+                      <a:off x="0" y="0"/>
+                      <a:ext cx="5731510" cy="3101975"/>
+                    </a:xfrm>
+                    <a:prstGeom prst="rect">
+                      <a:avLst/>
+                    </a:prstGeom>
+                  </pic:spPr>
+                </pic:pic>
+              </a:graphicData>
+            </a:graphic>
+          </wp:inline>
+        </w:drawing>
+      </w:r>
+    </w:p>
+    <w:p/>
+    <w:p>
+      <w:r>
+        <w:t>Database setup:</w:t>
+      </w:r>
+    </w:p>
+    <w:p>
+      <w:r>
+        <w:lastRenderedPageBreak/>
+        <w:drawing>
+          <wp:inline distT="0" distB="0" distL="0" distR="0" wp14:anchorId="2E20948C" wp14:editId="476F1A80">
+            <wp:extent cx="5731510" cy="2639695"/>
+            <wp:effectExtent l="0" t="0" r="2540" b="8255"/>
+            <wp:docPr id="714618515" name="Picture 1"/>
+            <wp:cNvGraphicFramePr>
+              <a:graphicFrameLocks xmlns:a="http://schemas.openxmlformats.org/drawingml/2006/main" noChangeAspect="1"/>
+            </wp:cNvGraphicFramePr>
+            <a:graphic xmlns:a="http://schemas.openxmlformats.org/drawingml/2006/main">
+              <a:graphicData uri="http://schemas.openxmlformats.org/drawingml/2006/picture">
+                <pic:pic xmlns:pic="http://schemas.openxmlformats.org/drawingml/2006/picture">
+                  <pic:nvPicPr>
+                    <pic:cNvPr id="714618515" name=""/>
+                    <pic:cNvPicPr/>
+                  </pic:nvPicPr>
+                  <pic:blipFill>
+                    <a:blip r:embed="rId10"/>
+                    <a:stretch>
+                      <a:fillRect/>
+                    </a:stretch>
+                  </pic:blipFill>
+                  <pic:spPr>
+                    <a:xfrm>
+                      <a:off x="0" y="0"/>
+                      <a:ext cx="5731510" cy="2639695"/>
+                    </a:xfrm>
+                    <a:prstGeom prst="rect">
+                      <a:avLst/>
+                    </a:prstGeom>
+                  </pic:spPr>
+                </pic:pic>
+              </a:graphicData>
+            </a:graphic>
+          </wp:inline>
+        </w:drawing>
+      </w:r>
+    </w:p>
+    <w:p>
+      <w:r>
+        <w:drawing>
+          <wp:inline distT="0" distB="0" distL="0" distR="0" wp14:anchorId="77F6B833" wp14:editId="2F31AB59">
+            <wp:extent cx="5731510" cy="3204210"/>
+            <wp:effectExtent l="0" t="0" r="2540" b="0"/>
+            <wp:docPr id="656570605" name="Picture 1"/>
+            <wp:cNvGraphicFramePr>
+              <a:graphicFrameLocks xmlns:a="http://schemas.openxmlformats.org/drawingml/2006/main" noChangeAspect="1"/>
+            </wp:cNvGraphicFramePr>
+            <a:graphic xmlns:a="http://schemas.openxmlformats.org/drawingml/2006/main">
+              <a:graphicData uri="http://schemas.openxmlformats.org/drawingml/2006/picture">
+                <pic:pic xmlns:pic="http://schemas.openxmlformats.org/drawingml/2006/picture">
+                  <pic:nvPicPr>
+                    <pic:cNvPr id="656570605" name=""/>
+                    <pic:cNvPicPr/>
+                  </pic:nvPicPr>
+                  <pic:blipFill>
+                    <a:blip r:embed="rId11"/>
+                    <a:stretch>
+                      <a:fillRect/>
+                    </a:stretch>
+                  </pic:blipFill>
+                  <pic:spPr>
+                    <a:xfrm>
+                      <a:off x="0" y="0"/>
+                      <a:ext cx="5731510" cy="3204210"/>
+                    </a:xfrm>
+                    <a:prstGeom prst="rect">
+                      <a:avLst/>
+                    </a:prstGeom>
+                  </pic:spPr>
+                </pic:pic>
+              </a:graphicData>
+            </a:graphic>
+          </wp:inline>
+        </w:drawing>
+      </w:r>
+    </w:p>
+    <w:p>
+      <w:r>
+        <w:rPr>
+          <w:b/>
+          <w:bCs/>
+        </w:rPr>
+        <w:t>Enumerations</w:t>
+      </w:r>
+    </w:p>
+    <w:p>
+      <w:r>
+        <w:t>The Medicine &amp; Inventory service uses four Java enums to restrict certain fields to a fixed set of valid values. Each enum is stored in PostgreSQL as readable text using @Enumerated(EnumType.STRING), so the database holds values like PENDING rather than position numbers, and adding or reordering values later does not corrupt existing rows. Invalid values are rejected at compile time instead of causing errors at runtime.</w:t>
+      </w:r>
+    </w:p>
+    <w:p>
+      <w:pPr>
+        <w:numPr>
+          <w:ilvl w:val="0"/>
+          <w:numId w:val="1"/>
+        </w:numPr>
+      </w:pPr>
+      <w:r>
+        <w:rPr>
+          <w:b/>
+          <w:bCs/>
+        </w:rPr>
+        <w:t>DosageForm</w:t>
+      </w:r>
+      <w:r>
+        <w:t xml:space="preserve"> (medicine.form): the physical form of a medicine. Values: TABLET, CAPSULE, SYRUP, INJECTION, OINTMENT, CONSUMABLE (for supplies such as gauze or ORS sachets). It supports filtering the medicine catalogue by form.</w:t>
+      </w:r>
+    </w:p>
+    <w:p>
+      <w:pPr>
+        <w:numPr>
+          <w:ilvl w:val="0"/>
+          <w:numId w:val="1"/>
+        </w:numPr>
+      </w:pPr>
+      <w:r>
+        <w:rPr>
+          <w:b/>
+          <w:bCs/>
+        </w:rPr>
+        <w:lastRenderedPageBreak/>
+        <w:t>RequestStatus</w:t>
+      </w:r>
+      <w:r>
+        <w:t xml:space="preserve"> (replenishment_request.status): the life cycle of a stock replenishment request (an indent), following the real-world flow from a health centre to the district store: </w:t>
+      </w:r>
+    </w:p>
+    <w:p>
+      <w:pPr>
+        <w:numPr>
+          <w:ilvl w:val="1"/>
+          <w:numId w:val="1"/>
+        </w:numPr>
+      </w:pPr>
+      <w:r>
+        <w:t>PENDING: raised and waiting for an authorized officer.</w:t>
+      </w:r>
+    </w:p>
+    <w:p>
+      <w:pPr>
+        <w:numPr>
+          <w:ilvl w:val="1"/>
+          <w:numId w:val="1"/>
+        </w:numPr>
+      </w:pPr>
+      <w:r>
+        <w:t>APPROVED: accepted by the officer.</w:t>
+      </w:r>
+    </w:p>
+    <w:p>
+      <w:pPr>
+        <w:numPr>
+          <w:ilvl w:val="1"/>
+          <w:numId w:val="1"/>
+        </w:numPr>
+      </w:pPr>
+      <w:r>
+        <w:t>DISPATCHED: sent from the store.</w:t>
+      </w:r>
+    </w:p>
+    <w:p>
+      <w:pPr>
+        <w:numPr>
+          <w:ilvl w:val="1"/>
+          <w:numId w:val="1"/>
+        </w:numPr>
+      </w:pPr>
+      <w:r>
+        <w:t>RECEIVED: arrived at the centre, which adds a new stock batch.</w:t>
+      </w:r>
+    </w:p>
+    <w:p>
+      <w:pPr>
+        <w:numPr>
+          <w:ilvl w:val="1"/>
+          <w:numId w:val="1"/>
+        </w:numPr>
+      </w:pPr>
+      <w:r>
+        <w:t>REJECTED: declined by the officer.</w:t>
+      </w:r>
+    </w:p>
+    <w:p>
+      <w:r>
+        <w:t>The service allows only forward transitions (PENDING → APPROVED or REJECTED, APPROVED → DISPATCHED, DISPATCHED → RECEIVED), and any other change is refused.</w:t>
+      </w:r>
+    </w:p>
+    <w:p>
+      <w:pPr>
+        <w:numPr>
+          <w:ilvl w:val="0"/>
+          <w:numId w:val="1"/>
+        </w:numPr>
+      </w:pPr>
+      <w:r>
+        <w:rPr>
+          <w:b/>
+          <w:bCs/>
+        </w:rPr>
+        <w:t>Priority</w:t>
+      </w:r>
+      <w:r>
+        <w:t xml:space="preserve"> (replenishment_request.priority): how urgently a request needs action, so the officer’s dashboard can sort it. </w:t>
+      </w:r>
+    </w:p>
+    <w:p>
+      <w:pPr>
+        <w:numPr>
+          <w:ilvl w:val="1"/>
+          <w:numId w:val="1"/>
+        </w:numPr>
+      </w:pPr>
+      <w:r>
+        <w:t>HIGH: the medicine is out of stock, or it is on the essential medicines list.</w:t>
+      </w:r>
+    </w:p>
+    <w:p>
+      <w:pPr>
+        <w:numPr>
+          <w:ilvl w:val="1"/>
+          <w:numId w:val="1"/>
+        </w:numPr>
+      </w:pPr>
+      <w:r>
+        <w:t>MEDIUM: stock is below half the reorder level.</w:t>
+      </w:r>
+    </w:p>
+    <w:p>
+      <w:pPr>
+        <w:numPr>
+          <w:ilvl w:val="1"/>
+          <w:numId w:val="1"/>
+        </w:numPr>
+      </w:pPr>
+      <w:r>
+        <w:t>LOW: stock is otherwise below the reorder level.</w:t>
+      </w:r>
+    </w:p>
+    <w:p>
+      <w:pPr>
+        <w:numPr>
+          <w:ilvl w:val="0"/>
+          <w:numId w:val="1"/>
+        </w:numPr>
+      </w:pPr>
+      <w:r>
+        <w:rPr>
+          <w:b/>
+          <w:bCs/>
+        </w:rPr>
+        <w:t>RequestSource</w:t>
+      </w:r>
+      <w:r>
+        <w:t xml:space="preserve"> (replenishment_request.source): who created the request. </w:t>
+      </w:r>
+    </w:p>
+    <w:p>
+      <w:pPr>
+        <w:numPr>
+          <w:ilvl w:val="1"/>
+          <w:numId w:val="1"/>
+        </w:numPr>
+      </w:pPr>
+      <w:r>
+        <w:t>AUTO: generated by the system when issuing a medicine dropped the centre’s total stock below the reorder level.</w:t>
+      </w:r>
+    </w:p>
+    <w:p>
+      <w:pPr>
+        <w:numPr>
+          <w:ilvl w:val="1"/>
+          <w:numId w:val="1"/>
+        </w:numPr>
+      </w:pPr>
+      <w:r>
+        <w:t>MANUAL: reported by a health worker through the request form (as in the problem statement’s illustrative example).</w:t>
+      </w:r>
+    </w:p>
+    <w:p>
+      <w:r>
+        <w:drawing>
+          <wp:inline distT="0" distB="0" distL="0" distR="0" wp14:anchorId="28AFAD81" wp14:editId="18EBF373">
+            <wp:extent cx="5731510" cy="2893060"/>
+            <wp:effectExtent l="0" t="0" r="2540" b="2540"/>
+            <wp:docPr id="142742387" name="Picture 1"/>
+            <wp:cNvGraphicFramePr>
+              <a:graphicFrameLocks xmlns:a="http://schemas.openxmlformats.org/drawingml/2006/main" noChangeAspect="1"/>
+            </wp:cNvGraphicFramePr>
+            <a:graphic xmlns:a="http://schemas.openxmlformats.org/drawingml/2006/main">
+              <a:graphicData uri="http://schemas.openxmlformats.org/drawingml/2006/picture">
+                <pic:pic xmlns:pic="http://schemas.openxmlformats.org/drawingml/2006/picture">
+                  <pic:nvPicPr>
+                    <pic:cNvPr id="142742387" name=""/>
+                    <pic:cNvPicPr/>
+                  </pic:nvPicPr>
+                  <pic:blipFill>
+                    <a:blip r:embed="rId12"/>
+                    <a:stretch>
+                      <a:fillRect/>
+                    </a:stretch>
+                  </pic:blipFill>
+                  <pic:spPr>
+                    <a:xfrm>
+                      <a:off x="0" y="0"/>
+                      <a:ext cx="5731510" cy="2893060"/>
+                    </a:xfrm>
+                    <a:prstGeom prst="rect">
+                      <a:avLst/>
+                    </a:prstGeom>
+                  </pic:spPr>
+                </pic:pic>
+              </a:graphicData>
+            </a:graphic>
+          </wp:inline>
+        </w:drawing>
+      </w:r>
+    </w:p>
+    <w:p/>
+    <w:p/>
+    <w:p>
+      <w:r>
+        <w:t>Entity</w:t>
+      </w:r>
+    </w:p>
+    <w:p>
+      <w:r>
+        <w:rPr>
+          <w:b/>
+          <w:bCs/>
+        </w:rPr>
+        <w:t>an entity is a Java class that represents one database table.</w:t>
+      </w:r>
+      <w:r>
+        <w:t xml:space="preserve"> Each object of that class is one row, and each field is one column.</w:t>
+      </w:r>
+    </w:p>
+    <w:p>
+      <w:r>
+        <w:t>You write the class with labels like @Entity, @Id and @Column, and Spring (through Hibernate) does two things for you automatically:</w:t>
+      </w:r>
+    </w:p>
+    <w:p>
+      <w:pPr>
+        <w:numPr>
+          <w:ilvl w:val="0"/>
+          <w:numId w:val="2"/>
+        </w:numPr>
+      </w:pPr>
+      <w:r>
+        <w:rPr>
+          <w:b/>
+          <w:bCs/>
+        </w:rPr>
+        <w:t>It creates the table</w:t>
+      </w:r>
+      <w:r>
+        <w:t xml:space="preserve"> in PostgreSQL from the class, so you never write CREATE TABLE.</w:t>
+      </w:r>
+    </w:p>
+    <w:p>
+      <w:pPr>
+        <w:numPr>
+          <w:ilvl w:val="0"/>
+          <w:numId w:val="2"/>
+        </w:numPr>
+      </w:pPr>
+      <w:r>
+        <w:rPr>
+          <w:b/>
+          <w:bCs/>
+        </w:rPr>
+        <w:t>It converts between Java objects and rows.</w:t>
+      </w:r>
+      <w:r>
+        <w:t xml:space="preserve"> When you save a Medicine object, it becomes a row; when you read a row, it comes back as a Medicine object.</w:t>
+      </w:r>
+    </w:p>
+    <w:p>
+      <w:r>
+        <w:drawing>
+          <wp:inline distT="0" distB="0" distL="0" distR="0" wp14:anchorId="20D72569" wp14:editId="7BF89367">
+            <wp:extent cx="5731510" cy="3225165"/>
+            <wp:effectExtent l="0" t="0" r="2540" b="0"/>
+            <wp:docPr id="1135433759" name="Picture 1"/>
+            <wp:cNvGraphicFramePr>
+              <a:graphicFrameLocks xmlns:a="http://schemas.openxmlformats.org/drawingml/2006/main" noChangeAspect="1"/>
+            </wp:cNvGraphicFramePr>
+            <a:graphic xmlns:a="http://schemas.openxmlformats.org/drawingml/2006/main">
+              <a:graphicData uri="http://schemas.openxmlformats.org/drawingml/2006/picture">
+                <pic:pic xmlns:pic="http://schemas.openxmlformats.org/drawingml/2006/picture">
+                  <pic:nvPicPr>
+                    <pic:cNvPr id="1135433759" name=""/>
+                    <pic:cNvPicPr/>
+                  </pic:nvPicPr>
+                  <pic:blipFill>
+                    <a:blip r:embed="rId13"/>
+                    <a:stretch>
+                      <a:fillRect/>
+                    </a:stretch>
+                  </pic:blipFill>
+                  <pic:spPr>
+                    <a:xfrm>
+                      <a:off x="0" y="0"/>
+                      <a:ext cx="5731510" cy="3225165"/>
+                    </a:xfrm>
+                    <a:prstGeom prst="rect">
+                      <a:avLst/>
+                    </a:prstGeom>
+                  </pic:spPr>
+                </pic:pic>
+              </a:graphicData>
+            </a:graphic>
+          </wp:inline>
+        </w:drawing>
+      </w:r>
+    </w:p>
+    <w:p>
+      <w:r>
+        <w:rPr>
+          <w:noProof/>
+        </w:rPr>
+        <w:lastRenderedPageBreak/>
+        <w:drawing>
+          <wp:inline distT="0" distB="0" distL="0" distR="0" wp14:anchorId="4C4BA307" wp14:editId="374B9430">
+            <wp:extent cx="5722620" cy="3544570"/>
+            <wp:effectExtent l="0" t="0" r="0" b="0"/>
+            <wp:docPr id="1689715846" name="Picture 1"/>
+            <wp:cNvGraphicFramePr>
+              <a:graphicFrameLocks xmlns:a="http://schemas.openxmlformats.org/drawingml/2006/main" noChangeAspect="1"/>
+            </wp:cNvGraphicFramePr>
+            <a:graphic xmlns:a="http://schemas.openxmlformats.org/drawingml/2006/main">
+              <a:graphicData uri="http://schemas.openxmlformats.org/drawingml/2006/picture">
+                <pic:pic xmlns:pic="http://schemas.openxmlformats.org/drawingml/2006/picture">
+                  <pic:nvPicPr>
+                    <pic:cNvPr id="0" name="Picture 1"/>
+                    <pic:cNvPicPr>
+                      <a:picLocks noChangeAspect="1" noChangeArrowheads="1"/>
+                    </pic:cNvPicPr>
+                  </pic:nvPicPr>
+                  <pic:blipFill>
+                    <a:blip r:embed="rId14" cstate="print">
+                      <a:extLst>
+                        <a:ext uri="{28A0092B-C50C-407E-A947-70E740481C1C}">
+                          <a14:useLocalDpi xmlns:a14="http://schemas.microsoft.com/office/drawing/2010/main" val="0"/>
+                        </a:ext>
+                      </a:extLst>
+                    </a:blip>
+                    <a:srcRect/>
+                    <a:stretch>
+                      <a:fillRect/>
+                    </a:stretch>
+                  </pic:blipFill>
+                  <pic:spPr bwMode="auto">
+                    <a:xfrm>
+                      <a:off x="0" y="0"/>
+                      <a:ext cx="5722620" cy="3544570"/>
+                    </a:xfrm>
+                    <a:prstGeom prst="rect">
+                      <a:avLst/>
+                    </a:prstGeom>
+                    <a:noFill/>
+                    <a:ln>
+                      <a:noFill/>
+                    </a:ln>
+                  </pic:spPr>
+                </pic:pic>
+              </a:graphicData>
+            </a:graphic>
+          </wp:inline>
+        </w:drawing>
+      </w:r>
+    </w:p>
+    <w:p>
+      <w:r>
+        <w:t>Repository layer</w:t>
+      </w:r>
+    </w:p>
+    <w:p>
+      <w:r>
+        <w:drawing>
+          <wp:inline distT="0" distB="0" distL="0" distR="0" wp14:anchorId="0A83B074" wp14:editId="79151439">
+            <wp:extent cx="4635738" cy="2673487"/>
+            <wp:effectExtent l="0" t="0" r="0" b="0"/>
+            <wp:docPr id="825309290" name="Picture 1"/>
+            <wp:cNvGraphicFramePr>
+              <a:graphicFrameLocks xmlns:a="http://schemas.openxmlformats.org/drawingml/2006/main" noChangeAspect="1"/>
+            </wp:cNvGraphicFramePr>
+            <a:graphic xmlns:a="http://schemas.openxmlformats.org/drawingml/2006/main">
+              <a:graphicData uri="http://schemas.openxmlformats.org/drawingml/2006/picture">
+                <pic:pic xmlns:pic="http://schemas.openxmlformats.org/drawingml/2006/picture">
+                  <pic:nvPicPr>
+                    <pic:cNvPr id="825309290" name=""/>
+                    <pic:cNvPicPr/>
+                  </pic:nvPicPr>
+                  <pic:blipFill>
+                    <a:blip r:embed="rId15"/>
+                    <a:stretch>
+                      <a:fillRect/>
+                    </a:stretch>
+                  </pic:blipFill>
+                  <pic:spPr>
+                    <a:xfrm>
+                      <a:off x="0" y="0"/>
+                      <a:ext cx="4635738" cy="2673487"/>
+                    </a:xfrm>
+                    <a:prstGeom prst="rect">
+                      <a:avLst/>
+                    </a:prstGeom>
+                  </pic:spPr>
+                </pic:pic>
+              </a:graphicData>
+            </a:graphic>
+          </wp:inline>
+        </w:drawing>
+      </w:r>
+    </w:p>
+    <w:p>
+      <w:r>
+        <w:lastRenderedPageBreak/>
+        <w:drawing>
+          <wp:inline distT="0" distB="0" distL="0" distR="0" wp14:anchorId="58D18754" wp14:editId="258009C2">
+            <wp:extent cx="5731510" cy="3248025"/>
+            <wp:effectExtent l="0" t="0" r="2540" b="9525"/>
+            <wp:docPr id="1180210584" name="Picture 1"/>
+            <wp:cNvGraphicFramePr>
+              <a:graphicFrameLocks xmlns:a="http://schemas.openxmlformats.org/drawingml/2006/main" noChangeAspect="1"/>
+            </wp:cNvGraphicFramePr>
+            <a:graphic xmlns:a="http://schemas.openxmlformats.org/drawingml/2006/main">
+              <a:graphicData uri="http://schemas.openxmlformats.org/drawingml/2006/picture">
+                <pic:pic xmlns:pic="http://schemas.openxmlformats.org/drawingml/2006/picture">
+                  <pic:nvPicPr>
+                    <pic:cNvPr id="1180210584" name=""/>
+                    <pic:cNvPicPr/>
+                  </pic:nvPicPr>
+                  <pic:blipFill>
+                    <a:blip r:embed="rId16"/>
+                    <a:stretch>
+                      <a:fillRect/>
+                    </a:stretch>
+                  </pic:blipFill>
+                  <pic:spPr>
+                    <a:xfrm>
+                      <a:off x="0" y="0"/>
+                      <a:ext cx="5731510" cy="3248025"/>
+                    </a:xfrm>
+                    <a:prstGeom prst="rect">
+                      <a:avLst/>
+                    </a:prstGeom>
+                  </pic:spPr>
+                </pic:pic>
+              </a:graphicData>
+            </a:graphic>
+          </wp:inline>
+        </w:drawing>
+      </w:r>
+    </w:p>
     <w:sectPr>
       <w:pgSz w:w="11906" w:h="16838"/>
       <w:pgMar w:top="1440" w:right="1440" w:bottom="1440" w:left="1440" w:header="708" w:footer="708" w:gutter="0"/>
@@ -126,6 +797,279 @@
     </w:sectPr>
   </w:body>
 </w:document>
+</file>
+
+<file path=word/numbering.xml><?xml version="1.0" encoding="utf-8"?>
+<w:numbering xmlns:wpc="http://schemas.microsoft.com/office/word/2010/wordprocessingCanvas" xmlns:cx="http://schemas.microsoft.com/office/drawing/2014/chartex" xmlns:cx1="http://schemas.microsoft.com/office/drawing/2015/9/8/chartex" xmlns:cx2="http://schemas.microsoft.com/office/drawing/2015/10/21/chartex" xmlns:cx3="http://schemas.microsoft.com/office/drawing/2016/5/9/chartex" xmlns:cx4="http://schemas.microsoft.com/office/drawing/2016/5/10/chartex" xmlns:cx5="http://schemas.microsoft.com/office/drawing/2016/5/11/chartex" xmlns:cx6="http://schemas.microsoft.com/office/drawing/2016/5/12/chartex" xmlns:cx7="http://schemas.microsoft.com/office/drawing/2016/5/13/chartex" xmlns:cx8="http://schemas.microsoft.com/office/drawing/2016/5/14/chartex" xmlns:mc="http://schemas.openxmlformats.org/markup-compatibility/2006" xmlns:aink="http://schemas.microsoft.com/office/drawing/2016/ink" xmlns:am3d="http://schemas.microsoft.com/office/drawing/2017/model3d" xmlns:o="urn:schemas-microsoft-com:office:office" xmlns:oel="http://schemas.microsoft.com/office/2019/extlst" xmlns:r="http://schemas.openxmlformats.org/officeDocument/2006/relationships" xmlns:m="http://schemas.openxmlformats.org/officeDocument/2006/math" xmlns:v="urn:schemas-microsoft-com:vml" xmlns:wp14="http://schemas.microsoft.com/office/word/2010/wordprocessingDrawing" xmlns:wp="http://schemas.openxmlformats.org/drawingml/2006/wordprocessingDrawing" xmlns:w10="urn:schemas-microsoft-com:office:word" xmlns:w="http://schemas.openxmlformats.org/wordprocessingml/2006/main" xmlns:w14="http://schemas.microsoft.com/office/word/2010/wordml" xmlns:w15="http://schemas.microsoft.com/office/word/2012/wordml" xmlns:w16cex="http://schemas.microsoft.com/office/word/2018/wordml/cex" xmlns:w16cid="http://schemas.microsoft.com/office/word/2016/wordml/cid" xmlns:w16="http://schemas.microsoft.com/office/word/2018/wordml" xmlns:w16du="http://schemas.microsoft.com/office/word/2023/wordml/word16du" xmlns:w16sdtdh="http://schemas.microsoft.com/office/word/2020/wordml/sdtdatahash" xmlns:w16sdtfl="http://schemas.microsoft.com/office/word/2024/wordml/sdtformatlock" xmlns:w16se="http://schemas.microsoft.com/office/word/2015/wordml/symex" xmlns:wpg="http://schemas.microsoft.com/office/word/2010/wordprocessingGroup" xmlns:wpi="http://schemas.microsoft.com/office/word/2010/wordprocessingInk" xmlns:wne="http://schemas.microsoft.com/office/word/2006/wordml" xmlns:wps="http://schemas.microsoft.com/office/word/2010/wordprocessingShape" mc:Ignorable="w14 w15 w16se w16cid w16 w16cex w16sdtdh w16sdtfl w16du wp14">
+  <w:abstractNum w:abstractNumId="0" w15:restartNumberingAfterBreak="0">
+    <w:nsid w:val="4DF02DC6"/>
+    <w:multiLevelType w:val="multilevel"/>
+    <w:tmpl w:val="639830AA"/>
+    <w:lvl w:ilvl="0">
+      <w:start w:val="1"/>
+      <w:numFmt w:val="decimal"/>
+      <w:lvlText w:val="%1."/>
+      <w:lvlJc w:val="left"/>
+      <w:pPr>
+        <w:tabs>
+          <w:tab w:val="num" w:pos="720"/>
+        </w:tabs>
+        <w:ind w:left="720" w:hanging="360"/>
+      </w:pPr>
+    </w:lvl>
+    <w:lvl w:ilvl="1" w:tentative="1">
+      <w:start w:val="1"/>
+      <w:numFmt w:val="decimal"/>
+      <w:lvlText w:val="%2."/>
+      <w:lvlJc w:val="left"/>
+      <w:pPr>
+        <w:tabs>
+          <w:tab w:val="num" w:pos="1440"/>
+        </w:tabs>
+        <w:ind w:left="1440" w:hanging="360"/>
+      </w:pPr>
+    </w:lvl>
+    <w:lvl w:ilvl="2" w:tentative="1">
+      <w:start w:val="1"/>
+      <w:numFmt w:val="decimal"/>
+      <w:lvlText w:val="%3."/>
+      <w:lvlJc w:val="left"/>
+      <w:pPr>
+        <w:tabs>
+          <w:tab w:val="num" w:pos="2160"/>
+        </w:tabs>
+        <w:ind w:left="2160" w:hanging="360"/>
+      </w:pPr>
+    </w:lvl>
+    <w:lvl w:ilvl="3" w:tentative="1">
+      <w:start w:val="1"/>
+      <w:numFmt w:val="decimal"/>
+      <w:lvlText w:val="%4."/>
+      <w:lvlJc w:val="left"/>
+      <w:pPr>
+        <w:tabs>
+          <w:tab w:val="num" w:pos="2880"/>
+        </w:tabs>
+        <w:ind w:left="2880" w:hanging="360"/>
+      </w:pPr>
+    </w:lvl>
+    <w:lvl w:ilvl="4" w:tentative="1">
+      <w:start w:val="1"/>
+      <w:numFmt w:val="decimal"/>
+      <w:lvlText w:val="%5."/>
+      <w:lvlJc w:val="left"/>
+      <w:pPr>
+        <w:tabs>
+          <w:tab w:val="num" w:pos="3600"/>
+        </w:tabs>
+        <w:ind w:left="3600" w:hanging="360"/>
+      </w:pPr>
+    </w:lvl>
+    <w:lvl w:ilvl="5" w:tentative="1">
+      <w:start w:val="1"/>
+      <w:numFmt w:val="decimal"/>
+      <w:lvlText w:val="%6."/>
+      <w:lvlJc w:val="left"/>
+      <w:pPr>
+        <w:tabs>
+          <w:tab w:val="num" w:pos="4320"/>
+        </w:tabs>
+        <w:ind w:left="4320" w:hanging="360"/>
+      </w:pPr>
+    </w:lvl>
+    <w:lvl w:ilvl="6" w:tentative="1">
+      <w:start w:val="1"/>
+      <w:numFmt w:val="decimal"/>
+      <w:lvlText w:val="%7."/>
+      <w:lvlJc w:val="left"/>
+      <w:pPr>
+        <w:tabs>
+          <w:tab w:val="num" w:pos="5040"/>
+        </w:tabs>
+        <w:ind w:left="5040" w:hanging="360"/>
+      </w:pPr>
+    </w:lvl>
+    <w:lvl w:ilvl="7" w:tentative="1">
+      <w:start w:val="1"/>
+      <w:numFmt w:val="decimal"/>
+      <w:lvlText w:val="%8."/>
+      <w:lvlJc w:val="left"/>
+      <w:pPr>
+        <w:tabs>
+          <w:tab w:val="num" w:pos="5760"/>
+        </w:tabs>
+        <w:ind w:left="5760" w:hanging="360"/>
+      </w:pPr>
+    </w:lvl>
+    <w:lvl w:ilvl="8" w:tentative="1">
+      <w:start w:val="1"/>
+      <w:numFmt w:val="decimal"/>
+      <w:lvlText w:val="%9."/>
+      <w:lvlJc w:val="left"/>
+      <w:pPr>
+        <w:tabs>
+          <w:tab w:val="num" w:pos="6480"/>
+        </w:tabs>
+        <w:ind w:left="6480" w:hanging="360"/>
+      </w:pPr>
+    </w:lvl>
+  </w:abstractNum>
+  <w:abstractNum w:abstractNumId="1" w15:restartNumberingAfterBreak="0">
+    <w:nsid w:val="75D661E3"/>
+    <w:multiLevelType w:val="multilevel"/>
+    <w:tmpl w:val="F7E264DE"/>
+    <w:lvl w:ilvl="0">
+      <w:start w:val="1"/>
+      <w:numFmt w:val="bullet"/>
+      <w:lvlText w:val=""/>
+      <w:lvlJc w:val="left"/>
+      <w:pPr>
+        <w:tabs>
+          <w:tab w:val="num" w:pos="720"/>
+        </w:tabs>
+        <w:ind w:left="720" w:hanging="360"/>
+      </w:pPr>
+      <w:rPr>
+        <w:rFonts w:ascii="Symbol" w:hAnsi="Symbol" w:hint="default"/>
+        <w:sz w:val="20"/>
+      </w:rPr>
+    </w:lvl>
+    <w:lvl w:ilvl="1">
+      <w:start w:val="1"/>
+      <w:numFmt w:val="bullet"/>
+      <w:lvlText w:val="o"/>
+      <w:lvlJc w:val="left"/>
+      <w:pPr>
+        <w:tabs>
+          <w:tab w:val="num" w:pos="1440"/>
+        </w:tabs>
+        <w:ind w:left="1440" w:hanging="360"/>
+      </w:pPr>
+      <w:rPr>
+        <w:rFonts w:ascii="Courier New" w:hAnsi="Courier New" w:hint="default"/>
+        <w:sz w:val="20"/>
+      </w:rPr>
+    </w:lvl>
+    <w:lvl w:ilvl="2" w:tentative="1">
+      <w:start w:val="1"/>
+      <w:numFmt w:val="bullet"/>
+      <w:lvlText w:val=""/>
+      <w:lvlJc w:val="left"/>
+      <w:pPr>
+        <w:tabs>
+          <w:tab w:val="num" w:pos="2160"/>
+        </w:tabs>
+        <w:ind w:left="2160" w:hanging="360"/>
+      </w:pPr>
+      <w:rPr>
+        <w:rFonts w:ascii="Wingdings" w:hAnsi="Wingdings" w:hint="default"/>
+        <w:sz w:val="20"/>
+      </w:rPr>
+    </w:lvl>
+    <w:lvl w:ilvl="3" w:tentative="1">
+      <w:start w:val="1"/>
+      <w:numFmt w:val="bullet"/>
+      <w:lvlText w:val=""/>
+      <w:lvlJc w:val="left"/>
+      <w:pPr>
+        <w:tabs>
+          <w:tab w:val="num" w:pos="2880"/>
+        </w:tabs>
+        <w:ind w:left="2880" w:hanging="360"/>
+      </w:pPr>
+      <w:rPr>
+        <w:rFonts w:ascii="Wingdings" w:hAnsi="Wingdings" w:hint="default"/>
+        <w:sz w:val="20"/>
+      </w:rPr>
+    </w:lvl>
+    <w:lvl w:ilvl="4" w:tentative="1">
+      <w:start w:val="1"/>
+      <w:numFmt w:val="bullet"/>
+      <w:lvlText w:val=""/>
+      <w:lvlJc w:val="left"/>
+      <w:pPr>
+        <w:tabs>
+          <w:tab w:val="num" w:pos="3600"/>
+        </w:tabs>
+        <w:ind w:left="3600" w:hanging="360"/>
+      </w:pPr>
+      <w:rPr>
+        <w:rFonts w:ascii="Wingdings" w:hAnsi="Wingdings" w:hint="default"/>
+        <w:sz w:val="20"/>
+      </w:rPr>
+    </w:lvl>
+    <w:lvl w:ilvl="5" w:tentative="1">
+      <w:start w:val="1"/>
+      <w:numFmt w:val="bullet"/>
+      <w:lvlText w:val=""/>
+      <w:lvlJc w:val="left"/>
+      <w:pPr>
+        <w:tabs>
+          <w:tab w:val="num" w:pos="4320"/>
+        </w:tabs>
+        <w:ind w:left="4320" w:hanging="360"/>
+      </w:pPr>
+      <w:rPr>
+        <w:rFonts w:ascii="Wingdings" w:hAnsi="Wingdings" w:hint="default"/>
+        <w:sz w:val="20"/>
+      </w:rPr>
+    </w:lvl>
+    <w:lvl w:ilvl="6" w:tentative="1">
+      <w:start w:val="1"/>
+      <w:numFmt w:val="bullet"/>
+      <w:lvlText w:val=""/>
+      <w:lvlJc w:val="left"/>
+      <w:pPr>
+        <w:tabs>
+          <w:tab w:val="num" w:pos="5040"/>
+        </w:tabs>
+        <w:ind w:left="5040" w:hanging="360"/>
+      </w:pPr>
+      <w:rPr>
+        <w:rFonts w:ascii="Wingdings" w:hAnsi="Wingdings" w:hint="default"/>
+        <w:sz w:val="20"/>
+      </w:rPr>
+    </w:lvl>
+    <w:lvl w:ilvl="7" w:tentative="1">
+      <w:start w:val="1"/>
+      <w:numFmt w:val="bullet"/>
+      <w:lvlText w:val=""/>
+      <w:lvlJc w:val="left"/>
+      <w:pPr>
+        <w:tabs>
+          <w:tab w:val="num" w:pos="5760"/>
+        </w:tabs>
+        <w:ind w:left="5760" w:hanging="360"/>
+      </w:pPr>
+      <w:rPr>
+        <w:rFonts w:ascii="Wingdings" w:hAnsi="Wingdings" w:hint="default"/>
+        <w:sz w:val="20"/>
+      </w:rPr>
+    </w:lvl>
+    <w:lvl w:ilvl="8" w:tentative="1">
+      <w:start w:val="1"/>
+      <w:numFmt w:val="bullet"/>
+      <w:lvlText w:val=""/>
+      <w:lvlJc w:val="left"/>
+      <w:pPr>
+        <w:tabs>
+          <w:tab w:val="num" w:pos="6480"/>
+        </w:tabs>
+        <w:ind w:left="6480" w:hanging="360"/>
+      </w:pPr>
+      <w:rPr>
+        <w:rFonts w:ascii="Wingdings" w:hAnsi="Wingdings" w:hint="default"/>
+        <w:sz w:val="20"/>
+      </w:rPr>
+    </w:lvl>
+  </w:abstractNum>
+  <w:num w:numId="1" w16cid:durableId="303587639">
+    <w:abstractNumId w:val="1"/>
+  </w:num>
+  <w:num w:numId="2" w16cid:durableId="985209351">
+    <w:abstractNumId w:val="0"/>
+  </w:num>
+</w:numbering>
 </file>
 
 <file path=word/styles.xml><?xml version="1.0" encoding="utf-8"?>
@@ -731,7 +1675,6 @@
   <w:style w:type="character" w:default="1" w:styleId="DefaultParagraphFont">
     <w:name w:val="Default Paragraph Font"/>
     <w:uiPriority w:val="1"/>
-    <w:semiHidden/>
     <w:unhideWhenUsed/>
   </w:style>
   <w:style w:type="table" w:default="1" w:styleId="TableNormal">

</xml_diff>